<commit_message>
Change SEO tasks to text format with reasons
</commit_message>
<xml_diff>
--- a/reports-docx/SEO ТЗ - Аквабурмастер.docx
+++ b/reports-docx/SEO ТЗ - Аквабурмастер.docx
@@ -41,33 +41,7 @@
         <w:pStyle w:val="Heading1"/>
       </w:pPr>
       <w:r>
-        <w:t>Задача</w:t>
-      </w:r>
-    </w:p>
-    <w:p>
-      <w:r>
-        <w:t>Задача: проверить проекты из таблицы доступов, найти SEO-проблемы, исправить безопасные пункты в CMS и подготовить ТЗ на оставшиеся правки.</w:t>
-      </w:r>
-    </w:p>
-    <w:p>
-      <w:pPr>
-        <w:pStyle w:val="Heading1"/>
-      </w:pPr>
-      <w:r>
-        <w:t>Откуда взяты данные</w:t>
-      </w:r>
-    </w:p>
-    <w:p>
-      <w:r>
-        <w:t>Данные: таблица доступов Google Sheets, таблица SEO-материалов/курсов, публичная проверка сайтов, доступные CMS-админки, результаты проверки через браузер и curl. Яндекс.Вебмастер напрямую не проверен: был нужен вход в Яндекс ID.</w:t>
-      </w:r>
-    </w:p>
-    <w:p>
-      <w:pPr>
-        <w:pStyle w:val="Heading1"/>
-      </w:pPr>
-      <w:r>
-        <w:t>Что сделано</w:t>
+        <w:t>Сделано</w:t>
       </w:r>
     </w:p>
     <w:p>
@@ -115,466 +89,175 @@
         <w:pStyle w:val="Heading1"/>
       </w:pPr>
       <w:r>
-        <w:t>Факты проверки</w:t>
+        <w:t>Что нужно сделать</w:t>
       </w:r>
     </w:p>
     <w:p>
       <w:pPr>
-        <w:pStyle w:val="ListBullet"/>
+        <w:spacing w:before="160" w:after="40"/>
       </w:pPr>
       <w:r>
-        <w:t>https://aquaburmaster.ru/uslugi/ редиректит на главную.</w:t>
+        <w:rPr>
+          <w:b/>
+          <w:sz w:val="22"/>
+        </w:rPr>
+        <w:t>P1. Исправить редиректы со слэшем</w:t>
       </w:r>
     </w:p>
     <w:p>
       <w:pPr>
-        <w:pStyle w:val="ListBullet"/>
+        <w:spacing w:after="40"/>
+        <w:ind w:left="360"/>
       </w:pPr>
       <w:r>
-        <w:t>https://aquaburmaster.ru/kontakty/ редиректит на главную.</w:t>
+        <w:rPr>
+          <w:b/>
+        </w:rPr>
+        <w:t xml:space="preserve">Что сделать: </w:t>
+      </w:r>
+      <w:r>
+        <w:t>Сделать /uslugi/ -&gt; /uslugi и /kontakty/ -&gt; /kontakty либо выбрать единый формат URL без редиректа на главную.</w:t>
       </w:r>
     </w:p>
     <w:p>
       <w:pPr>
-        <w:pStyle w:val="ListBullet"/>
+        <w:spacing w:after="120"/>
+        <w:ind w:left="360"/>
       </w:pPr>
       <w:r>
-        <w:t>sitemap.xml остался файлом 2018 года с генератором mysitemapgenerator.com.</w:t>
+        <w:rPr>
+          <w:b/>
+        </w:rPr>
+        <w:t xml:space="preserve">Зачем: </w:t>
+      </w:r>
+      <w:r>
+        <w:t>Чтобы одна и та же страница не открывалась по двум адресам и не расходовала краулинговый бюджет.</w:t>
       </w:r>
     </w:p>
     <w:p>
       <w:pPr>
-        <w:pStyle w:val="Heading1"/>
+        <w:spacing w:before="160" w:after="40"/>
       </w:pPr>
       <w:r>
-        <w:t>ТЗ на доработку</w:t>
-      </w:r>
-    </w:p>
-    <w:tbl>
-      <w:tblPr>
-        <w:tblStyle w:val="TableGrid"/>
-        <w:tblW w:type="dxa" w:w="9360"/>
-        <w:jc w:val="left"/>
-        <w:tblLook w:firstColumn="1" w:firstRow="1" w:lastColumn="0" w:lastRow="0" w:noHBand="0" w:noVBand="1" w:val="04A0"/>
-        <w:tblInd w:type="dxa" w:w="120"/>
-      </w:tblPr>
-      <w:tblGrid>
-        <w:gridCol w:w="900"/>
-        <w:gridCol w:w="2460"/>
-        <w:gridCol w:w="6000"/>
-      </w:tblGrid>
-      <w:tr>
-        <w:tc>
-          <w:tcPr>
-            <w:tcW w:type="dxa" w:w="3120"/>
-            <w:vAlign w:val="top"/>
-            <w:tcMar>
-              <w:top w:w="80" w:type="dxa"/>
-              <w:start w:w="120" w:type="dxa"/>
-              <w:bottom w:w="80" w:type="dxa"/>
-              <w:end w:w="120" w:type="dxa"/>
-            </w:tcMar>
-            <w:shd w:fill="E8EEF5"/>
-          </w:tcPr>
-          <w:p>
-            <w:pPr>
-              <w:spacing w:after="40"/>
-            </w:pPr>
-            <w:r/>
-            <w:r>
-              <w:rPr>
-                <w:b/>
-              </w:rPr>
-              <w:t>Приоритет</w:t>
-            </w:r>
-          </w:p>
-        </w:tc>
-        <w:tc>
-          <w:tcPr>
-            <w:tcW w:type="dxa" w:w="3120"/>
-            <w:vAlign w:val="top"/>
-            <w:tcMar>
-              <w:top w:w="80" w:type="dxa"/>
-              <w:start w:w="120" w:type="dxa"/>
-              <w:bottom w:w="80" w:type="dxa"/>
-              <w:end w:w="120" w:type="dxa"/>
-            </w:tcMar>
-            <w:shd w:fill="E8EEF5"/>
-          </w:tcPr>
-          <w:p>
-            <w:pPr>
-              <w:spacing w:after="40"/>
-            </w:pPr>
-            <w:r/>
-            <w:r>
-              <w:rPr>
-                <w:b/>
-              </w:rPr>
-              <w:t>Задача</w:t>
-            </w:r>
-          </w:p>
-        </w:tc>
-        <w:tc>
-          <w:tcPr>
-            <w:tcW w:type="dxa" w:w="3120"/>
-            <w:vAlign w:val="top"/>
-            <w:tcMar>
-              <w:top w:w="80" w:type="dxa"/>
-              <w:start w:w="120" w:type="dxa"/>
-              <w:bottom w:w="80" w:type="dxa"/>
-              <w:end w:w="120" w:type="dxa"/>
-            </w:tcMar>
-            <w:shd w:fill="E8EEF5"/>
-          </w:tcPr>
-          <w:p>
-            <w:pPr>
-              <w:spacing w:after="40"/>
-            </w:pPr>
-            <w:r/>
-            <w:r>
-              <w:rPr>
-                <w:b/>
-              </w:rPr>
-              <w:t>Что сделать</w:t>
-            </w:r>
-          </w:p>
-        </w:tc>
-      </w:tr>
-      <w:tr>
-        <w:tc>
-          <w:tcPr>
-            <w:tcW w:type="dxa" w:w="900"/>
-            <w:vAlign w:val="top"/>
-            <w:tcMar>
-              <w:top w:w="80" w:type="dxa"/>
-              <w:start w:w="120" w:type="dxa"/>
-              <w:bottom w:w="80" w:type="dxa"/>
-              <w:end w:w="120" w:type="dxa"/>
-            </w:tcMar>
-          </w:tcPr>
-          <w:p>
-            <w:pPr>
-              <w:spacing w:after="40"/>
-            </w:pPr>
-            <w:r/>
-            <w:r>
-              <w:rPr>
-                <w:b w:val="0"/>
-              </w:rPr>
-              <w:t>P1</w:t>
-            </w:r>
-          </w:p>
-        </w:tc>
-        <w:tc>
-          <w:tcPr>
-            <w:tcW w:type="dxa" w:w="2460"/>
-            <w:vAlign w:val="top"/>
-            <w:tcMar>
-              <w:top w:w="80" w:type="dxa"/>
-              <w:start w:w="120" w:type="dxa"/>
-              <w:bottom w:w="80" w:type="dxa"/>
-              <w:end w:w="120" w:type="dxa"/>
-            </w:tcMar>
-          </w:tcPr>
-          <w:p>
-            <w:pPr>
-              <w:spacing w:after="40"/>
-            </w:pPr>
-            <w:r/>
-            <w:r>
-              <w:rPr>
-                <w:b w:val="0"/>
-              </w:rPr>
-              <w:t>Исправить редиректы со слэшем</w:t>
-            </w:r>
-          </w:p>
-        </w:tc>
-        <w:tc>
-          <w:tcPr>
-            <w:tcW w:type="dxa" w:w="6000"/>
-            <w:vAlign w:val="top"/>
-            <w:tcMar>
-              <w:top w:w="80" w:type="dxa"/>
-              <w:start w:w="120" w:type="dxa"/>
-              <w:bottom w:w="80" w:type="dxa"/>
-              <w:end w:w="120" w:type="dxa"/>
-            </w:tcMar>
-          </w:tcPr>
-          <w:p>
-            <w:pPr>
-              <w:spacing w:after="40"/>
-            </w:pPr>
-            <w:r/>
-            <w:r>
-              <w:rPr>
-                <w:b w:val="0"/>
-              </w:rPr>
-              <w:t>Сделать /uslugi/ -&gt; /uslugi и /kontakty/ -&gt; /kontakty либо выбрать единый формат URL без редиректа на главную.</w:t>
-            </w:r>
-          </w:p>
-        </w:tc>
-      </w:tr>
-      <w:tr>
-        <w:tc>
-          <w:tcPr>
-            <w:tcW w:type="dxa" w:w="900"/>
-            <w:vAlign w:val="top"/>
-            <w:tcMar>
-              <w:top w:w="80" w:type="dxa"/>
-              <w:start w:w="120" w:type="dxa"/>
-              <w:bottom w:w="80" w:type="dxa"/>
-              <w:end w:w="120" w:type="dxa"/>
-            </w:tcMar>
-          </w:tcPr>
-          <w:p>
-            <w:pPr>
-              <w:spacing w:after="40"/>
-            </w:pPr>
-            <w:r/>
-            <w:r>
-              <w:rPr>
-                <w:b w:val="0"/>
-              </w:rPr>
-              <w:t>P1</w:t>
-            </w:r>
-          </w:p>
-        </w:tc>
-        <w:tc>
-          <w:tcPr>
-            <w:tcW w:type="dxa" w:w="2460"/>
-            <w:vAlign w:val="top"/>
-            <w:tcMar>
-              <w:top w:w="80" w:type="dxa"/>
-              <w:start w:w="120" w:type="dxa"/>
-              <w:bottom w:w="80" w:type="dxa"/>
-              <w:end w:w="120" w:type="dxa"/>
-            </w:tcMar>
-          </w:tcPr>
-          <w:p>
-            <w:pPr>
-              <w:spacing w:after="40"/>
-            </w:pPr>
-            <w:r/>
-            <w:r>
-              <w:rPr>
-                <w:b w:val="0"/>
-              </w:rPr>
-              <w:t>Добавить canonical</w:t>
-            </w:r>
-          </w:p>
-        </w:tc>
-        <w:tc>
-          <w:tcPr>
-            <w:tcW w:type="dxa" w:w="6000"/>
-            <w:vAlign w:val="top"/>
-            <w:tcMar>
-              <w:top w:w="80" w:type="dxa"/>
-              <w:start w:w="120" w:type="dxa"/>
-              <w:bottom w:w="80" w:type="dxa"/>
-              <w:end w:w="120" w:type="dxa"/>
-            </w:tcMar>
-          </w:tcPr>
-          <w:p>
-            <w:pPr>
-              <w:spacing w:after="40"/>
-            </w:pPr>
-            <w:r/>
-            <w:r>
-              <w:rPr>
-                <w:b w:val="0"/>
-              </w:rPr>
-              <w:t>Вывести canonical на главной, разделах, статьях и услугах.</w:t>
-            </w:r>
-          </w:p>
-        </w:tc>
-      </w:tr>
-      <w:tr>
-        <w:tc>
-          <w:tcPr>
-            <w:tcW w:type="dxa" w:w="900"/>
-            <w:vAlign w:val="top"/>
-            <w:tcMar>
-              <w:top w:w="80" w:type="dxa"/>
-              <w:start w:w="120" w:type="dxa"/>
-              <w:bottom w:w="80" w:type="dxa"/>
-              <w:end w:w="120" w:type="dxa"/>
-            </w:tcMar>
-          </w:tcPr>
-          <w:p>
-            <w:pPr>
-              <w:spacing w:after="40"/>
-            </w:pPr>
-            <w:r/>
-            <w:r>
-              <w:rPr>
-                <w:b w:val="0"/>
-              </w:rPr>
-              <w:t>P2</w:t>
-            </w:r>
-          </w:p>
-        </w:tc>
-        <w:tc>
-          <w:tcPr>
-            <w:tcW w:type="dxa" w:w="2460"/>
-            <w:vAlign w:val="top"/>
-            <w:tcMar>
-              <w:top w:w="80" w:type="dxa"/>
-              <w:start w:w="120" w:type="dxa"/>
-              <w:bottom w:w="80" w:type="dxa"/>
-              <w:end w:w="120" w:type="dxa"/>
-            </w:tcMar>
-          </w:tcPr>
-          <w:p>
-            <w:pPr>
-              <w:spacing w:after="40"/>
-            </w:pPr>
-            <w:r/>
-            <w:r>
-              <w:rPr>
-                <w:b w:val="0"/>
-              </w:rPr>
-              <w:t>Починить генерацию sitemap</w:t>
-            </w:r>
-          </w:p>
-        </w:tc>
-        <w:tc>
-          <w:tcPr>
-            <w:tcW w:type="dxa" w:w="6000"/>
-            <w:vAlign w:val="top"/>
-            <w:tcMar>
-              <w:top w:w="80" w:type="dxa"/>
-              <w:start w:w="120" w:type="dxa"/>
-              <w:bottom w:w="80" w:type="dxa"/>
-              <w:end w:w="120" w:type="dxa"/>
-            </w:tcMar>
-          </w:tcPr>
-          <w:p>
-            <w:pPr>
-              <w:spacing w:after="40"/>
-            </w:pPr>
-            <w:r/>
-            <w:r>
-              <w:rPr>
-                <w:b w:val="0"/>
-              </w:rPr>
-              <w:t>Проверить путь и права записи: публичный sitemap.xml не меняется после генерации в CMS.</w:t>
-            </w:r>
-          </w:p>
-        </w:tc>
-      </w:tr>
-      <w:tr>
-        <w:tc>
-          <w:tcPr>
-            <w:tcW w:type="dxa" w:w="900"/>
-            <w:vAlign w:val="top"/>
-            <w:tcMar>
-              <w:top w:w="80" w:type="dxa"/>
-              <w:start w:w="120" w:type="dxa"/>
-              <w:bottom w:w="80" w:type="dxa"/>
-              <w:end w:w="120" w:type="dxa"/>
-            </w:tcMar>
-          </w:tcPr>
-          <w:p>
-            <w:pPr>
-              <w:spacing w:after="40"/>
-            </w:pPr>
-            <w:r/>
-            <w:r>
-              <w:rPr>
-                <w:b w:val="0"/>
-              </w:rPr>
-              <w:t>P2</w:t>
-            </w:r>
-          </w:p>
-        </w:tc>
-        <w:tc>
-          <w:tcPr>
-            <w:tcW w:type="dxa" w:w="2460"/>
-            <w:vAlign w:val="top"/>
-            <w:tcMar>
-              <w:top w:w="80" w:type="dxa"/>
-              <w:start w:w="120" w:type="dxa"/>
-              <w:bottom w:w="80" w:type="dxa"/>
-              <w:end w:w="120" w:type="dxa"/>
-            </w:tcMar>
-          </w:tcPr>
-          <w:p>
-            <w:pPr>
-              <w:spacing w:after="40"/>
-            </w:pPr>
-            <w:r/>
-            <w:r>
-              <w:rPr>
-                <w:b w:val="0"/>
-              </w:rPr>
-              <w:t>Обновить PHP</w:t>
-            </w:r>
-          </w:p>
-        </w:tc>
-        <w:tc>
-          <w:tcPr>
-            <w:tcW w:type="dxa" w:w="6000"/>
-            <w:vAlign w:val="top"/>
-            <w:tcMar>
-              <w:top w:w="80" w:type="dxa"/>
-              <w:start w:w="120" w:type="dxa"/>
-              <w:bottom w:w="80" w:type="dxa"/>
-              <w:end w:w="120" w:type="dxa"/>
-            </w:tcMar>
-          </w:tcPr>
-          <w:p>
-            <w:pPr>
-              <w:spacing w:after="40"/>
-            </w:pPr>
-            <w:r/>
-            <w:r>
-              <w:rPr>
-                <w:b w:val="0"/>
-              </w:rPr>
-              <w:t>Сайт раскрывает X-Powered-By: PHP/5.6.40. Версия устаревшая.</w:t>
-            </w:r>
-          </w:p>
-        </w:tc>
-      </w:tr>
-    </w:tbl>
-    <w:p>
-      <w:pPr>
-        <w:pStyle w:val="Heading1"/>
-      </w:pPr>
-      <w:r>
-        <w:t>Приемка после доработки</w:t>
+        <w:rPr>
+          <w:b/>
+          <w:sz w:val="22"/>
+        </w:rPr>
+        <w:t>P1. Добавить canonical</w:t>
       </w:r>
     </w:p>
     <w:p>
       <w:pPr>
-        <w:pStyle w:val="ListBullet"/>
+        <w:spacing w:after="40"/>
+        <w:ind w:left="360"/>
       </w:pPr>
       <w:r>
-        <w:t>После правок проверить ответы URL через curl или аналогичный инструмент.</w:t>
+        <w:rPr>
+          <w:b/>
+        </w:rPr>
+        <w:t xml:space="preserve">Что сделать: </w:t>
+      </w:r>
+      <w:r>
+        <w:t>Вывести canonical на главной, разделах, статьях и услугах.</w:t>
       </w:r>
     </w:p>
     <w:p>
       <w:pPr>
-        <w:pStyle w:val="ListBullet"/>
+        <w:spacing w:after="120"/>
+        <w:ind w:left="360"/>
       </w:pPr>
       <w:r>
-        <w:t>Проверить наличие canonical в HTML целевых страниц.</w:t>
+        <w:rPr>
+          <w:b/>
+        </w:rPr>
+        <w:t xml:space="preserve">Зачем: </w:t>
+      </w:r>
+      <w:r>
+        <w:t>Чтобы Яндекс и Google понимали основной URL страницы и не выбирали дубль самостоятельно.</w:t>
       </w:r>
     </w:p>
     <w:p>
       <w:pPr>
-        <w:pStyle w:val="ListBullet"/>
+        <w:spacing w:before="160" w:after="40"/>
       </w:pPr>
       <w:r>
-        <w:t>Проверить sitemap.xml и robots.txt после изменений.</w:t>
+        <w:rPr>
+          <w:b/>
+          <w:sz w:val="22"/>
+        </w:rPr>
+        <w:t>P2. Починить генерацию sitemap</w:t>
       </w:r>
     </w:p>
     <w:p>
       <w:pPr>
-        <w:pStyle w:val="ListBullet"/>
+        <w:spacing w:after="40"/>
+        <w:ind w:left="360"/>
       </w:pPr>
       <w:r>
-        <w:t>После выдачи доступа зайти в Яндекс.Вебмастер и отправить важные страницы на переобход.</w:t>
+        <w:rPr>
+          <w:b/>
+        </w:rPr>
+        <w:t xml:space="preserve">Что сделать: </w:t>
+      </w:r>
+      <w:r>
+        <w:t>Проверить путь и права записи: публичный sitemap.xml не меняется после генерации в CMS.</w:t>
+      </w:r>
+    </w:p>
+    <w:p>
+      <w:pPr>
+        <w:spacing w:after="120"/>
+        <w:ind w:left="360"/>
+      </w:pPr>
+      <w:r>
+        <w:rPr>
+          <w:b/>
+        </w:rPr>
+        <w:t xml:space="preserve">Зачем: </w:t>
+      </w:r>
+      <w:r>
+        <w:t>Чтобы поисковые системы получали актуальный список индексируемых страниц без старых и ошибочных URL.</w:t>
+      </w:r>
+    </w:p>
+    <w:p>
+      <w:pPr>
+        <w:spacing w:before="160" w:after="40"/>
+      </w:pPr>
+      <w:r>
+        <w:rPr>
+          <w:b/>
+          <w:sz w:val="22"/>
+        </w:rPr>
+        <w:t>P2. Обновить PHP</w:t>
+      </w:r>
+    </w:p>
+    <w:p>
+      <w:pPr>
+        <w:spacing w:after="40"/>
+        <w:ind w:left="360"/>
+      </w:pPr>
+      <w:r>
+        <w:rPr>
+          <w:b/>
+        </w:rPr>
+        <w:t xml:space="preserve">Что сделать: </w:t>
+      </w:r>
+      <w:r>
+        <w:t>Сайт раскрывает X-Powered-By: PHP/5.6.40. Версия устаревшая.</w:t>
+      </w:r>
+    </w:p>
+    <w:p>
+      <w:pPr>
+        <w:spacing w:after="120"/>
+        <w:ind w:left="360"/>
+      </w:pPr>
+      <w:r>
+        <w:rPr>
+          <w:b/>
+        </w:rPr>
+        <w:t xml:space="preserve">Зачем: </w:t>
+      </w:r>
+      <w:r>
+        <w:t>Чтобы снизить технические риски и риски безопасности из-за устаревшей версии PHP.</w:t>
       </w:r>
     </w:p>
     <w:sectPr>

</xml_diff>

<commit_message>
Remove site date line and use numeric task numbering
</commit_message>
<xml_diff>
--- a/reports-docx/SEO ТЗ - Аквабурмастер.docx
+++ b/reports-docx/SEO ТЗ - Аквабурмастер.docx
@@ -14,26 +14,6 @@
           <w:sz w:val="40"/>
         </w:rPr>
         <w:t>SEO ТЗ: Аквабурмастер</w:t>
-      </w:r>
-    </w:p>
-    <w:p>
-      <w:r>
-        <w:rPr>
-          <w:b/>
-        </w:rPr>
-        <w:t xml:space="preserve">Сайт: </w:t>
-      </w:r>
-      <w:r>
-        <w:t>https://aquaburmaster.ru/</w:t>
-      </w:r>
-      <w:r>
-        <w:rPr>
-          <w:b/>
-        </w:rPr>
-        <w:t xml:space="preserve"> | Дата: </w:t>
-      </w:r>
-      <w:r>
-        <w:t>22.06.2026</w:t>
       </w:r>
     </w:p>
     <w:p>
@@ -101,7 +81,7 @@
           <w:b/>
           <w:sz w:val="22"/>
         </w:rPr>
-        <w:t>P1. Исправить редиректы со слэшем</w:t>
+        <w:t>1. Исправить редиректы со слэшем</w:t>
       </w:r>
     </w:p>
     <w:p>
@@ -143,7 +123,7 @@
           <w:b/>
           <w:sz w:val="22"/>
         </w:rPr>
-        <w:t>P1. Добавить canonical</w:t>
+        <w:t>2. Добавить canonical</w:t>
       </w:r>
     </w:p>
     <w:p>
@@ -185,7 +165,7 @@
           <w:b/>
           <w:sz w:val="22"/>
         </w:rPr>
-        <w:t>P2. Починить генерацию sitemap</w:t>
+        <w:t>3. Починить генерацию sitemap</w:t>
       </w:r>
     </w:p>
     <w:p>
@@ -227,7 +207,7 @@
           <w:b/>
           <w:sz w:val="22"/>
         </w:rPr>
-        <w:t>P2. Обновить PHP</w:t>
+        <w:t>4. Обновить PHP</w:t>
       </w:r>
     </w:p>
     <w:p>
@@ -261,7 +241,6 @@
       </w:r>
     </w:p>
     <w:sectPr>
-      <w:footerReference w:type="default" r:id="rId9"/>
       <w:pgSz w:w="12240" w:h="15840"/>
       <w:pgMar w:top="1440" w:right="1440" w:bottom="1440" w:left="1440" w:header="708" w:footer="708" w:gutter="0"/>
       <w:cols w:space="720"/>
@@ -269,24 +248,6 @@
     </w:sectPr>
   </w:body>
 </w:document>
-</file>
-
-<file path=word/footer1.xml><?xml version="1.0" encoding="utf-8"?>
-<w:ftr xmlns:m="http://schemas.openxmlformats.org/officeDocument/2006/math" xmlns:mc="http://schemas.openxmlformats.org/markup-compatibility/2006" xmlns:mo="http://schemas.microsoft.com/office/mac/office/2008/main" xmlns:mv="urn:schemas-microsoft-com:mac:vml" xmlns:o="urn:schemas-microsoft-com:office:office" xmlns:r="http://schemas.openxmlformats.org/officeDocument/2006/relationships" xmlns:v="urn:schemas-microsoft-com:vml" xmlns:w10="urn:schemas-microsoft-com:office:word" xmlns:w14="http://schemas.microsoft.com/office/word/2010/wordml" xmlns:w="http://schemas.openxmlformats.org/wordprocessingml/2006/main" xmlns:wne="http://schemas.microsoft.com/office/word/2006/wordml" xmlns:wp14="http://schemas.microsoft.com/office/word/2010/wordprocessingDrawing" xmlns:wp="http://schemas.openxmlformats.org/drawingml/2006/wordprocessingDrawing" xmlns:wpc="http://schemas.microsoft.com/office/word/2010/wordprocessingCanvas" xmlns:wpg="http://schemas.microsoft.com/office/word/2010/wordprocessingGroup" xmlns:wpi="http://schemas.microsoft.com/office/word/2010/wordprocessingInk" xmlns:wps="http://schemas.microsoft.com/office/word/2010/wordprocessingShape" mc:Ignorable="w14 wp14">
-  <w:p>
-    <w:pPr>
-      <w:pStyle w:val="Footer"/>
-      <w:jc w:val="right"/>
-    </w:pPr>
-    <w:r>
-      <w:rPr>
-        <w:color w:val="5A5A5A"/>
-        <w:sz w:val="18"/>
-      </w:rPr>
-      <w:t>SEO ТЗ, 22.06.2026</w:t>
-    </w:r>
-  </w:p>
-</w:ftr>
 </file>
 
 <file path=word/numbering.xml><?xml version="1.0" encoding="utf-8"?>

</xml_diff>

<commit_message>
Update Aquaburmaster live SEO check
</commit_message>
<xml_diff>
--- a/reports-docx/SEO ТЗ - Аквабурмастер.docx
+++ b/reports-docx/SEO ТЗ - Аквабурмастер.docx
@@ -29,7 +29,7 @@
         <w:pStyle w:val="ListBullet"/>
       </w:pPr>
       <w:r>
-        <w:t>Выполнен вход в ICMS v3.5.46.</w:t>
+        <w:t>Вход в ICMS работает, SEO-раздел проверен.</w:t>
       </w:r>
     </w:p>
     <w:p>
@@ -37,7 +37,7 @@
         <w:pStyle w:val="ListBullet"/>
       </w:pPr>
       <w:r>
-        <w:t>Открыт SEO-раздел.</w:t>
+        <w:t>Рекомендации не закрыты: /uslugi/ и /kontakty/ все еще уходят на главную.</w:t>
       </w:r>
     </w:p>
     <w:p>
@@ -45,7 +45,7 @@
         <w:pStyle w:val="ListBullet"/>
       </w:pPr>
       <w:r>
-        <w:t>Запущена штатная генерация sitemap.xml. CMS показала успешное сохранение.</w:t>
+        <w:t>Редирект со слэшем идет на серверном уровне до CMS. В списке CMS это не править.</w:t>
       </w:r>
     </w:p>
     <w:p>
@@ -53,7 +53,7 @@
         <w:pStyle w:val="ListBullet"/>
       </w:pPr>
       <w:r>
-        <w:t>Публичная проверка показала, что sitemap.xml не обновился. Правка не засчитана как завершенная.</w:t>
+        <w:t>sitemap.xml старый: 2018 год, генератор mysitemapgenerator.com.</w:t>
       </w:r>
     </w:p>
     <w:p>
@@ -61,7 +61,15 @@
         <w:pStyle w:val="ListBullet"/>
       </w:pPr>
       <w:r>
-        <w:t>Проверены SEO-редиректы: правил /uslugi/ -&gt; / и /kontakty/ -&gt; / в списке нет.</w:t>
+        <w:t>canonical не выводится, favicon.ico и favicon.svg отдают 404.</w:t>
+      </w:r>
+    </w:p>
+    <w:p>
+      <w:pPr>
+        <w:pStyle w:val="ListBullet"/>
+      </w:pPr>
+      <w:r>
+        <w:t>Яндекс.Вебмастер не открыт: нужен Яндекс ID, рабочего доступа в таблице нет.</w:t>
       </w:r>
     </w:p>
     <w:p>
@@ -81,7 +89,7 @@
           <w:b/>
           <w:sz w:val="22"/>
         </w:rPr>
-        <w:t>1. Исправить редиректы со слэшем</w:t>
+        <w:t>1. Исправить серверный редирект со слэшем</w:t>
       </w:r>
     </w:p>
     <w:p>
@@ -96,7 +104,7 @@
         <w:t xml:space="preserve">Что сделать: </w:t>
       </w:r>
       <w:r>
-        <w:t>Сделать /uslugi/ -&gt; /uslugi и /kontakty/ -&gt; /kontakty либо выбрать единый формат URL без редиректа на главную.</w:t>
+        <w:t>Сначала сохранить .htaccess/серверные правила. Убрать правило, которое отправляет URL со слэшем на главную. Настроить 301: /uslugi/ -&gt; /uslugi, /kontakty/ -&gt; /kontakty, /stati/ -&gt; /stati, /galereya/ -&gt; /galereya.</w:t>
       </w:r>
     </w:p>
     <w:p>
@@ -180,7 +188,7 @@
         <w:t xml:space="preserve">Что сделать: </w:t>
       </w:r>
       <w:r>
-        <w:t>Проверить путь и права записи: публичный sitemap.xml не меняется после генерации в CMS.</w:t>
+        <w:t>Проверить путь и права записи: публичный sitemap.xml не меняется после генерации.</w:t>
       </w:r>
     </w:p>
     <w:p>
@@ -207,7 +215,49 @@
           <w:b/>
           <w:sz w:val="22"/>
         </w:rPr>
-        <w:t>4. Обновить PHP</w:t>
+        <w:t>4. Добавить favicon для Вебмастера</w:t>
+      </w:r>
+    </w:p>
+    <w:p>
+      <w:pPr>
+        <w:spacing w:after="40"/>
+        <w:ind w:left="360"/>
+      </w:pPr>
+      <w:r>
+        <w:rPr>
+          <w:b/>
+        </w:rPr>
+        <w:t xml:space="preserve">Что сделать: </w:t>
+      </w:r>
+      <w:r>
+        <w:t>Сейчас есть /favicon.png, но /favicon.ico и /favicon.svg отдают 404. Добавить favicon.svg или PNG 120 x 120.</w:t>
+      </w:r>
+    </w:p>
+    <w:p>
+      <w:pPr>
+        <w:spacing w:after="120"/>
+        <w:ind w:left="360"/>
+      </w:pPr>
+      <w:r>
+        <w:rPr>
+          <w:b/>
+        </w:rPr>
+        <w:t xml:space="preserve">Зачем: </w:t>
+      </w:r>
+      <w:r>
+        <w:t>Чтобы убрать технический дубль или ошибку, которая мешает нормальной индексации сайта.</w:t>
+      </w:r>
+    </w:p>
+    <w:p>
+      <w:pPr>
+        <w:spacing w:before="160" w:after="40"/>
+      </w:pPr>
+      <w:r>
+        <w:rPr>
+          <w:b/>
+          <w:sz w:val="22"/>
+        </w:rPr>
+        <w:t>5. Обновить PHP</w:t>
       </w:r>
     </w:p>
     <w:p>

</xml_diff>

<commit_message>
Close Aquaburmaster favicon redirects
</commit_message>
<xml_diff>
--- a/reports-docx/SEO ТЗ - Аквабурмастер.docx
+++ b/reports-docx/SEO ТЗ - Аквабурмастер.docx
@@ -61,7 +61,15 @@
         <w:pStyle w:val="ListBullet"/>
       </w:pPr>
       <w:r>
-        <w:t>canonical не выводится, favicon.ico и favicon.svg отдают 404.</w:t>
+        <w:t>Favicon-404 закрыт в CMS: /favicon.ico и /favicon.svg теперь 301 на /favicon.png.</w:t>
+      </w:r>
+    </w:p>
+    <w:p>
+      <w:pPr>
+        <w:pStyle w:val="ListBullet"/>
+      </w:pPr>
+      <w:r>
+        <w:t>canonical не выводится.</w:t>
       </w:r>
     </w:p>
     <w:p>
@@ -215,7 +223,7 @@
           <w:b/>
           <w:sz w:val="22"/>
         </w:rPr>
-        <w:t>4. Добавить favicon для Вебмастера</w:t>
+        <w:t>4. Проверить favicon в Вебмастере</w:t>
       </w:r>
     </w:p>
     <w:p>
@@ -230,7 +238,7 @@
         <w:t xml:space="preserve">Что сделать: </w:t>
       </w:r>
       <w:r>
-        <w:t>Сейчас есть /favicon.png, но /favicon.ico и /favicon.svg отдают 404. Добавить favicon.svg или PNG 120 x 120.</w:t>
+        <w:t>404 закрыт редиректом на /favicon.png. Если рекомендация останется, добавить реальный SVG или PNG 120 x 120 через файловый доступ.</w:t>
       </w:r>
     </w:p>
     <w:p>
@@ -245,7 +253,7 @@
         <w:t xml:space="preserve">Зачем: </w:t>
       </w:r>
       <w:r>
-        <w:t>Чтобы убрать технический дубль или ошибку, которая мешает нормальной индексации сайта.</w:t>
+        <w:t>Чтобы убрать цепочки и дубли URL, которые мешают индексации и передаче веса страниц.</w:t>
       </w:r>
     </w:p>
     <w:p>

</xml_diff>

<commit_message>
Update Aquaburmaster SEO fixes and reports
</commit_message>
<xml_diff>
--- a/reports-docx/SEO ТЗ - Аквабурмастер.docx
+++ b/reports-docx/SEO ТЗ - Аквабурмастер.docx
@@ -69,7 +69,15 @@
         <w:pStyle w:val="ListBullet"/>
       </w:pPr>
       <w:r>
-        <w:t>canonical не выводится.</w:t>
+        <w:t>/prays_list закрыт: страница была в статусе Редактируется, переведена в Опубликован и теперь отдает 200.</w:t>
+      </w:r>
+    </w:p>
+    <w:p>
+      <w:pPr>
+        <w:pStyle w:val="ListBullet"/>
+      </w:pPr>
+      <w:r>
+        <w:t>canonical не выводится. В редакторе страниц, параметрах и метриках CMS поля canonical/head нет.</w:t>
       </w:r>
     </w:p>
     <w:p>
@@ -112,7 +120,7 @@
         <w:t xml:space="preserve">Что сделать: </w:t>
       </w:r>
       <w:r>
-        <w:t>Сначала сохранить .htaccess/серверные правила. Убрать правило, которое отправляет URL со слэшем на главную. Настроить 301: /uslugi/ -&gt; /uslugi, /kontakty/ -&gt; /kontakty, /stati/ -&gt; /stati, /galereya/ -&gt; /galereya.</w:t>
+        <w:t>Сначала сохранить .htaccess/серверные правила. Убрать правило, которое отправляет URL со слэшем на главную. Настроить 301: /uslugi/ -&gt; /uslugi, /kontakty/ -&gt; /kontakty, /stati/ -&gt; /stati, /galereya/ -&gt; /galereya, /prays_list/ -&gt; /prays_list.</w:t>
       </w:r>
     </w:p>
     <w:p>

</xml_diff>